<commit_message>
The run light, and a ground that performs the name
The folder was any icon set's folder. It now carries one green dot where a
status light sits — the folder is doing something, which is the whole product,
and a dot is the only detail that survives a 16px tab. The ring around it is
whatever surface sits behind, so the dot never touches the outline.

With the dot in the mark, the green full stop after the wordmark was saying the
same thing twice: it is gone from the site, the docs and the kit. Headlines keep
their own full stop — that is punctuation, not the logo.

The grid behind the covers is gone too. It is the house texture of every AI
product shipped since 2024 and said nothing about this one. In its place the
sheet itself is folded: one corner turns down and the underside is the brand
green. One shape, no pattern, and it performs the name instead of decorating
around it.

Co-Authored-By: Claude Opus 5 (1M context) <noreply@anthropic.com>
</commit_message>
<xml_diff>
--- a/public/kit/letterhead.docx
+++ b/public/kit/letterhead.docx
@@ -173,7 +173,7 @@
           <w:r>
             <w:drawing>
               <wp:inline distT="0" distB="0" distL="0" distR="0">
-                <wp:extent cx="3137535" cy="514350"/>
+                <wp:extent cx="2828925" cy="514350"/>
                 <wp:docPr id="1" name="foldrun"/>
                 <a:graphic>
                   <a:graphicData uri="http://schemas.openxmlformats.org/drawingml/2006/picture">
@@ -191,7 +191,7 @@
                       <pic:spPr>
                         <a:xfrm>
                           <a:off x="0" y="0"/>
-                          <a:ext cx="3137535" cy="514350"/>
+                          <a:ext cx="2828925" cy="514350"/>
                         </a:xfrm>
                         <a:prstGeom prst="rect">
                           <a:avLst/>

</xml_diff>